<commit_message>
Follow paging everywhere; document serviceBalances pages of 10
Co-Authored-By: Claude Opus 5.5 <noreply@anthropic.com>
</commit_message>
<xml_diff>
--- a/docs/Copilot cost data via Microsoft Graph.docx
+++ b/docs/Copilot cost data via Microsoft Graph.docx
@@ -1525,6 +1525,37 @@
       </w:r>
       <w:r>
         <w:t xml:space="preserve"> returns 404. Per-user data takes one call per user.</w:t>
+      </w:r>
+    </w:p>
+    <w:p>
+      <w:pPr>
+        <w:pStyle w:val="ListParagraph"/>
+        <w:numPr>
+          <w:ilvl w:val="0"/>
+          <w:numId w:val="2"/>
+        </w:numPr>
+        <w:spacing w:after="60"/>
+      </w:pPr>
+      <w:r>
+        <w:rPr>
+          <w:b/>
+          <w:bCs/>
+        </w:rPr>
+        <w:t xml:space="preserve">`serviceBalances` is paged at 10 items.</w:t>
+      </w:r>
+      <w:r>
+        <w:t xml:space="preserve"> The lab user had 11 services, and the 11th came only by following </w:t>
+      </w:r>
+      <w:r>
+        <w:rPr>
+          <w:rFonts w:ascii="Consolas" w:cs="Consolas" w:eastAsia="Consolas" w:hAnsi="Consolas"/>
+          <w:sz w:val="19"/>
+          <w:szCs w:val="19"/>
+        </w:rPr>
+        <w:t xml:space="preserve">@odata.nextLink</w:t>
+      </w:r>
+      <w:r>
+        <w:t xml:space="preserve">. Always follow it, unchanged.</w:t>
       </w:r>
     </w:p>
     <w:p>

</xml_diff>

<commit_message>
Doc: drop the questions-for-Microsoft section and representative wording
Co-Authored-By: Claude Opus 5.5 <noreply@anthropic.com>
</commit_message>
<xml_diff>
--- a/docs/Copilot cost data via Microsoft Graph.docx
+++ b/docs/Copilot cost data via Microsoft Graph.docx
@@ -2753,10 +2753,10 @@
           <w:b/>
           <w:bCs/>
         </w:rPr>
-        <w:t xml:space="preserve">Ask Microsoft to enable early access</w:t>
-      </w:r>
-      <w:r>
-        <w:t xml:space="preserve"> for your Entra tenant ID. App registration and admin consent alone do not enable it.</w:t>
+        <w:t xml:space="preserve">Have the tenant enabled for early access</w:t>
+      </w:r>
+      <w:r>
+        <w:t xml:space="preserve"> (it is enabled per Entra tenant ID). App registration and admin consent alone do not enable it.</w:t>
       </w:r>
     </w:p>
     <w:p>
@@ -4441,148 +4441,10 @@
           <w:b/>
           <w:bCs/>
         </w:rPr>
-        <w:t xml:space="preserve">Wait for application permissions.</w:t>
-      </w:r>
-      <w:r>
-        <w:t xml:space="preserve"> Microsoft's guide says app-only tokens do not satisfy the *current* access requirements. Ask your Microsoft representative whether application permissions are planned. If they arrive, the same collector can switch to a managed identity or certificate and drop the service account.</w:t>
-      </w:r>
-    </w:p>
-    <w:p>
-      <w:pPr>
-        <w:pStyle w:val="Heading1"/>
-      </w:pPr>
-      <w:r>
-        <w:t xml:space="preserve">7. Questions to raise with Microsoft</w:t>
-      </w:r>
-    </w:p>
-    <w:p>
-      <w:pPr>
-        <w:pStyle w:val="ListParagraph"/>
-        <w:numPr>
-          <w:ilvl w:val="0"/>
-          <w:numId w:val="4"/>
-        </w:numPr>
-        <w:spacing w:after="60"/>
-      </w:pPr>
-      <w:r>
-        <w:t xml:space="preserve">Are application (app-only) permissions planned for these APIs, and when?</w:t>
-      </w:r>
-    </w:p>
-    <w:p>
-      <w:pPr>
-        <w:pStyle w:val="ListParagraph"/>
-        <w:numPr>
-          <w:ilvl w:val="0"/>
-          <w:numId w:val="4"/>
-        </w:numPr>
-        <w:spacing w:after="60"/>
-      </w:pPr>
-      <w:r>
-        <w:rPr>
-          <w:rFonts w:ascii="Consolas" w:cs="Consolas" w:eastAsia="Consolas" w:hAnsi="Consolas"/>
-          <w:sz w:val="19"/>
-          <w:szCs w:val="19"/>
-        </w:rPr>
-        <w:t xml:space="preserve">GET /userBalances</w:t>
-      </w:r>
-      <w:r>
-        <w:t xml:space="preserve"> returns 404. Will there be a tenant-wide per-user consumption list, or is one call per user the intended pattern?</w:t>
-      </w:r>
-    </w:p>
-    <w:p>
-      <w:pPr>
-        <w:pStyle w:val="ListParagraph"/>
-        <w:numPr>
-          <w:ilvl w:val="0"/>
-          <w:numId w:val="4"/>
-        </w:numPr>
-        <w:spacing w:after="60"/>
-      </w:pPr>
-      <w:r>
-        <w:t xml:space="preserve">Can the write contract be documented (required </w:t>
-      </w:r>
-      <w:r>
-        <w:rPr>
-          <w:rFonts w:ascii="Consolas" w:cs="Consolas" w:eastAsia="Consolas" w:hAnsi="Consolas"/>
-          <w:sz w:val="19"/>
-          <w:szCs w:val="19"/>
-        </w:rPr>
-        <w:t xml:space="preserve">If-Match</w:t>
-      </w:r>
-      <w:r>
-        <w:t xml:space="preserve">, create and update bodies, alert ordering)? And can the 504 on create with inline groups, which leaves a </w:t>
-      </w:r>
-      <w:r>
-        <w:rPr>
-          <w:rFonts w:ascii="Consolas" w:cs="Consolas" w:eastAsia="Consolas" w:hAnsi="Consolas"/>
-          <w:sz w:val="19"/>
-          <w:szCs w:val="19"/>
-        </w:rPr>
-        <w:t xml:space="preserve">provisioningFailed</w:t>
-      </w:r>
-      <w:r>
-        <w:t xml:space="preserve"> policy behind, be fixed?</w:t>
-      </w:r>
-    </w:p>
-    <w:p>
-      <w:pPr>
-        <w:pStyle w:val="ListParagraph"/>
-        <w:numPr>
-          <w:ilvl w:val="0"/>
-          <w:numId w:val="4"/>
-        </w:numPr>
-        <w:spacing w:after="60"/>
-      </w:pPr>
-      <w:r>
-        <w:t xml:space="preserve">What is the expected data latency for </w:t>
-      </w:r>
-      <w:r>
-        <w:rPr>
-          <w:rFonts w:ascii="Consolas" w:cs="Consolas" w:eastAsia="Consolas" w:hAnsi="Consolas"/>
-          <w:sz w:val="19"/>
-          <w:szCs w:val="19"/>
-        </w:rPr>
-        <w:t xml:space="preserve">userBalances</w:t>
-      </w:r>
-      <w:r>
-        <w:t xml:space="preserve"> versus </w:t>
-      </w:r>
-      <w:r>
-        <w:rPr>
-          <w:rFonts w:ascii="Consolas" w:cs="Consolas" w:eastAsia="Consolas" w:hAnsi="Consolas"/>
-          <w:sz w:val="19"/>
-          <w:szCs w:val="19"/>
-        </w:rPr>
-        <w:t xml:space="preserve">getTenantCreditBalance()</w:t>
-      </w:r>
-      <w:r>
-        <w:t xml:space="preserve">?</w:t>
-      </w:r>
-    </w:p>
-    <w:p>
-      <w:pPr>
-        <w:pStyle w:val="ListParagraph"/>
-        <w:numPr>
-          <w:ilvl w:val="0"/>
-          <w:numId w:val="4"/>
-        </w:numPr>
-        <w:spacing w:after="60"/>
-      </w:pPr>
-      <w:r>
-        <w:t xml:space="preserve">What are the rate limits in numbers, so a collector can be sized?</w:t>
-      </w:r>
-    </w:p>
-    <w:p>
-      <w:pPr>
-        <w:pStyle w:val="ListParagraph"/>
-        <w:numPr>
-          <w:ilvl w:val="0"/>
-          <w:numId w:val="4"/>
-        </w:numPr>
-        <w:spacing w:after="60"/>
-      </w:pPr>
-      <w:r>
-        <w:t xml:space="preserve">When will these endpoints reach v1.0 (general availability)?</w:t>
+        <w:t xml:space="preserve">Switch to application permissions when they exist.</w:t>
+      </w:r>
+      <w:r>
+        <w:t xml:space="preserve"> Microsoft's guide says app-only tokens do not satisfy the *current* access requirements. If application permissions are added, the same collector can switch to a managed identity or certificate and drop the service account.</w:t>
       </w:r>
     </w:p>
     <w:sectPr>
@@ -4835,12 +4697,6 @@
   </w:num>
   <w:num w:numId="3">
     <w:abstractNumId w:val="3"/>
-    <w:lvlOverride w:ilvl="0">
-      <w:startOverride w:val="1"/>
-    </w:lvlOverride>
-  </w:num>
-  <w:num w:numId="4">
-    <w:abstractNumId w:val="4"/>
     <w:lvlOverride w:ilvl="0">
       <w:startOverride w:val="1"/>
     </w:lvlOverride>

</xml_diff>